<commit_message>
feat: migrate templates, database, and dashboard contract fields
</commit_message>
<xml_diff>
--- a/Models/2026_03_Modèle_Annonce_Journal.docx
+++ b/Models/2026_03_Modèle_Annonce_Journal.docx
@@ -57,7 +57,7 @@
           <w:sz w:val="18"/>
           <w:szCs w:val="18"/>
         </w:rPr>
-        <w:t>{{DEN_STE}} {{FORME_JUR}}</w:t>
+        <w:t>{{DENOMINATION_SOCIALE}} {{FORME_JURIDIQUE}}</w:t>
       </w:r>
       <w:r>
         <w:rPr>
@@ -205,7 +205,7 @@
           <w:sz w:val="18"/>
           <w:szCs w:val="18"/>
         </w:rPr>
-        <w:t>{{FORME_JUR}}</w:t>
+        <w:t>{{FORME_JURIDIQUE}}</w:t>
       </w:r>
       <w:r>
         <w:rPr>
@@ -280,7 +280,7 @@
           <w:sz w:val="18"/>
           <w:szCs w:val="18"/>
         </w:rPr>
-        <w:t>DEN_STE</w:t>
+        <w:t>DENOMINATION_SOCIALE</w:t>
       </w:r>
       <w:r>
         <w:rPr>
@@ -577,7 +577,7 @@
           <w:sz w:val="18"/>
           <w:szCs w:val="18"/>
         </w:rPr>
-        <w:t>{{STE_ADRESS}}</w:t>
+        <w:t>{{ADRESSE_SIEGE_SOCIAL}}</w:t>
       </w:r>
       <w:r>
         <w:rPr>
@@ -701,7 +701,7 @@
           <w:sz w:val="18"/>
           <w:szCs w:val="18"/>
         </w:rPr>
-        <w:t>{{CAPITAL}}</w:t>
+        <w:t>{{CAPITAL_SOCIAL}}</w:t>
       </w:r>
       <w:r>
         <w:rPr>
@@ -748,7 +748,7 @@
           <w:sz w:val="18"/>
           <w:szCs w:val="18"/>
         </w:rPr>
-        <w:t>{{PART_SOCIAL}}</w:t>
+        <w:t>{{NOMBRE_PARTS_SOCIALES}}</w:t>
       </w:r>
       <w:r>
         <w:rPr>
@@ -877,7 +877,7 @@
           <w:sz w:val="18"/>
           <w:szCs w:val="18"/>
         </w:rPr>
-        <w:t>{{CIVIL}}</w:t>
+        <w:t>{{CIVILITE_ASSOCIE}}</w:t>
       </w:r>
       <w:r>
         <w:rPr>
@@ -895,7 +895,7 @@
           <w:sz w:val="18"/>
           <w:szCs w:val="18"/>
         </w:rPr>
-        <w:t>{{PRENOM}}</w:t>
+        <w:t>{{PRENOM_ASSOCIE}}</w:t>
       </w:r>
       <w:r>
         <w:rPr>
@@ -913,7 +913,7 @@
           <w:sz w:val="18"/>
           <w:szCs w:val="18"/>
         </w:rPr>
-        <w:t>{{NOM}}</w:t>
+        <w:t>{{NOM_ASSOCIE}}</w:t>
       </w:r>
       <w:r>
         <w:rPr>
@@ -976,7 +976,7 @@
           <w:sz w:val="18"/>
           <w:szCs w:val="18"/>
         </w:rPr>
-        <w:t>{{PART_SOCIAL}}</w:t>
+        <w:t>{{NOMBRE_PARTS_SOCIALES}}</w:t>
       </w:r>
       <w:r>
         <w:rPr>
@@ -1079,7 +1079,7 @@
           <w:sz w:val="18"/>
           <w:szCs w:val="18"/>
         </w:rPr>
-        <w:t>{{PART_SOCIAL}}</w:t>
+        <w:t>{{NOMBRE_PARTS_SOCIALES}}</w:t>
       </w:r>
       <w:r>
         <w:rPr>
@@ -1177,7 +1177,7 @@
           <w:sz w:val="18"/>
           <w:szCs w:val="18"/>
         </w:rPr>
-        <w:t>{{CIVIL}} {{PRENOM}} {{NOM}}</w:t>
+        <w:t>{{CIVILITE_ASSOCIE}} {{PRENOM_ASSOCIE}} {{NOM_ASSOCIE}}</w:t>
       </w:r>
       <w:r>
         <w:rPr>

</xml_diff>